<commit_message>
07 TUST：refs→References 改名＋Chapter01~06 依精讀經驗重新佈署 v2
- References/（原 refs）：路徑全連動（build_ch00_v2/README/ARCHITECTURE）
- Chapter00 重建：02 總集 ★23/☆33 修正（前作手稿無 DOI 漏標）
- Chapter01~06 v2（build_chapters_v2.py，舊檔備份各章 _backup_260722/）：
  Ch1 前言五段作戰卡（B型雙支線+二階二分法+文獻編隊全配）；Ch2 假設條款
  前置法+QA入正文；Ch3 案例先行政治+證據三明治+震撼數字；Ch4 圖領句
  微結構+4.3 誠實限定框；Ch5 佔位問句+包裝落點；Ch6 貢獻五條+限制鏡像
- 文書規則全樹落地：黃底段落重點/藍字引用/紅圖綠表

Co-Authored-By: Claude Fable 5 <noreply@anthropic.com>
</commit_message>
<xml_diff>
--- a/07_SCI_TUST/Chapter00_總綱/02_參考文獻總集_APA.docx
+++ b/07_SCI_TUST/Chapter00_總綱/02_參考文獻總集_APA.docx
@@ -19,7 +19,7 @@
           <w:b w:val="0"/>
           <w:sz w:val="22"/>
         </w:rPr>
-        <w:t xml:space="preserve">標記：★＝全文精讀（23 篇）；☆＝摘要級（33 篇，Elsevier 付費牆——補件優先序見 refs/ACCESS_LIST.md，⚖ 請以校園權限下載放入 Wade_TD_SCI/Reference/ 我即補讀）。TUST 31/56=55%（達標 ≥50%）；零 MDPI；全數 Crossref 逐 DOI 驗證。正文引用時一律 author-year 藍字，如 </w:t>
+        <w:t xml:space="preserve">標記：★＝全文精讀（23 篇）；☆＝摘要級（33 篇，Elsevier 付費牆——補件優先序見 References/ACCESS_LIST.md，⚖ 請以校園權限下載放入 Wade_TD_SCI/Reference/ 我即補讀）。TUST 31/56=55%（達標 ≥50%）；零 MDPI；全數 Crossref 逐 DOI 驗證。正文引用時一律 author-year 藍字，如 </w:t>
       </w:r>
       <w:r>
         <w:rPr>
@@ -71,7 +71,7 @@
           <w:sz w:val="20"/>
           <w:highlight w:val="yellow"/>
         </w:rPr>
-        <w:t>【重點：正式引用格式=Elsevier name-year；本檔為總庫、逐篇筆記在 refs/reading_notes/】</w:t>
+        <w:t>【重點：正式引用格式=Elsevier name-year；本檔為總庫、逐篇筆記在 References/reading_notes/】</w:t>
       </w:r>
     </w:p>
     <w:p>
@@ -299,7 +299,7 @@
           <w:b w:val="0"/>
           <w:sz w:val="20"/>
         </w:rPr>
-        <w:t>☆ (被引 0) Tsai, C.-H., Li, H.-H., &amp; Wang, T.-T. (in review). Numerical simulation and mechanical interpretation of intermittent time-dependent deformation in tunnels. IJRMMS (投稿中),  (⚖ 引用方式待 TT)</w:t>
+        <w:t>★ (被引 0) Tsai, C.-H., Li, H.-H., &amp; Wang, T.-T. (in review). Numerical simulation and mechanical interpretation of intermittent time-dependent deformation in tunnels. IJRMMS (投稿中),  (⚖ 引用方式待 TT)</w:t>
       </w:r>
     </w:p>
     <w:p>

</xml_diff>